<commit_message>
Changed measurement from twenty to seventy millimetre.
</commit_message>
<xml_diff>
--- a/Electrical/SiteExperience/Mon 27-10-25/WriteUp/SiteExperience-28_10_25.docx
+++ b/Electrical/SiteExperience/Mon 27-10-25/WriteUp/SiteExperience-28_10_25.docx
@@ -23,38 +23,38 @@
         <w:rPr>
           <w:rtl w:val="0"/>
         </w:rPr>
-        <w:t xml:space="preserve"> I had my first site experience with a local electrician in Leicester. The scope of the project was a domestic setting. The end user has plans to transform an outerhouse into a social space with a cocktail bar and lounge area. On the day the first task I had to do was drill a twenty millimetre hole in the ceiling. It was a total of twelve holes. Above the ceiling lay doncaster earth sure cable that I had to pull through the ceiling hole. An “earthsure cable” differts slightly from the twin and earth cable that I used in college. The main difference is that the yellow and green wire has insulation already on the wire. Whereas, the twin and earth I use in college requires earth sleeving to be applied to the bronze copper wire. </w:t>
-      </w:r>
-    </w:p>
-    <w:p>
-      <w:pPr>
-        <w:rPr/>
-      </w:pPr>
-      <w:r>
-        <w:rPr>
-          <w:rtl w:val="0"/>
-        </w:rPr>
-      </w:r>
-    </w:p>
-    <w:p>
-      <w:pPr>
-        <w:rPr/>
-      </w:pPr>
-      <w:r>
-        <w:rPr>
-          <w:rtl w:val="0"/>
-        </w:rPr>
-      </w:r>
-    </w:p>
-    <w:p>
-      <w:pPr>
-        <w:rPr/>
-      </w:pPr>
-      <w:r>
-        <w:rPr>
-          <w:rtl w:val="0"/>
-        </w:rPr>
-        <w:t xml:space="preserve">After I pulled the cable through the ceiling I has to strip the cable and expose the copper to then screw into the terminals. There were two sets of wires in each terminal ports apart from the final bulb that only had one set of cpc, blue and brown wire. Because the lighting is on a radial circuit. Which means that the cable does not return back to the fuse board. You know are at the end of the radial circuit when there is only one set of wires.</w:t>
+        <w:t xml:space="preserve"> I had my first site experience with a local electrician in Leicester. The scope of the project was a domestic setting. The end user has plans to transform an outhouse into a social space with a cocktail bar and lounge area. On the day the first task I had to do was drill a seventy millimetre hole in the ceiling. It was a total of twelve holes. Above the ceiling lay a doncaster earth sure cable that I had to pull through the ceiling hole. An “earthsure cable” differs slightly from the twin and earth cable that I used in college. The main difference is that the yellow and green wire has insulation already on the wire. Whereas, the twin and earth I use in college requires earth sleeving to be applied to the bronze copper wire. </w:t>
+      </w:r>
+    </w:p>
+    <w:p>
+      <w:pPr>
+        <w:rPr/>
+      </w:pPr>
+      <w:r>
+        <w:rPr>
+          <w:rtl w:val="0"/>
+        </w:rPr>
+      </w:r>
+    </w:p>
+    <w:p>
+      <w:pPr>
+        <w:rPr/>
+      </w:pPr>
+      <w:r>
+        <w:rPr>
+          <w:rtl w:val="0"/>
+        </w:rPr>
+      </w:r>
+    </w:p>
+    <w:p>
+      <w:pPr>
+        <w:rPr/>
+      </w:pPr>
+      <w:r>
+        <w:rPr>
+          <w:rtl w:val="0"/>
+        </w:rPr>
+        <w:t xml:space="preserve">After I pulled the cable through the ceiling I had to strip the cable and expose the copper to then screw into the terminals. There were two sets of wires in each terminal port apart from the final bulb that only had one set of cpc, blue and brown wire. Because the lighting is on a radial circuit. Which means that the cable does not return back to the fuse board. You know are at the end of the radial circuit when there is only one set of wires.</w:t>
       </w:r>
     </w:p>
     <w:p>
@@ -171,7 +171,7 @@
           <wp:inline distB="114300" distT="114300" distL="114300" distR="114300">
             <wp:extent cx="2884973" cy="3843338"/>
             <wp:effectExtent b="50800" l="50800" r="50800" t="50800"/>
-            <wp:docPr id="2" name="image3.jpg"/>
+            <wp:docPr id="1" name="image3.jpg"/>
             <a:graphic>
               <a:graphicData uri="http://schemas.openxmlformats.org/drawingml/2006/picture">
                 <pic:pic>
@@ -231,12 +231,12 @@
           <wp:inline distB="114300" distT="114300" distL="114300" distR="114300">
             <wp:extent cx="2932895" cy="3919538"/>
             <wp:effectExtent b="50800" l="50800" r="50800" t="50800"/>
-            <wp:docPr id="1" name="image1.jpg"/>
+            <wp:docPr id="3" name="image2.jpg"/>
             <a:graphic>
               <a:graphicData uri="http://schemas.openxmlformats.org/drawingml/2006/picture">
                 <pic:pic>
                   <pic:nvPicPr>
-                    <pic:cNvPr id="0" name="image1.jpg"/>
+                    <pic:cNvPr id="0" name="image2.jpg"/>
                     <pic:cNvPicPr preferRelativeResize="0"/>
                   </pic:nvPicPr>
                   <pic:blipFill>
@@ -291,12 +291,12 @@
           <wp:inline distB="114300" distT="114300" distL="114300" distR="114300">
             <wp:extent cx="3063252" cy="4090988"/>
             <wp:effectExtent b="50800" l="50800" r="50800" t="50800"/>
-            <wp:docPr id="3" name="image4.jpg"/>
+            <wp:docPr id="2" name="image1.jpg"/>
             <a:graphic>
               <a:graphicData uri="http://schemas.openxmlformats.org/drawingml/2006/picture">
                 <pic:pic>
                   <pic:nvPicPr>
-                    <pic:cNvPr id="0" name="image4.jpg"/>
+                    <pic:cNvPr id="0" name="image1.jpg"/>
                     <pic:cNvPicPr preferRelativeResize="0"/>
                   </pic:nvPicPr>
                   <pic:blipFill>
@@ -351,12 +351,12 @@
           <wp:inline distB="114300" distT="114300" distL="114300" distR="114300">
             <wp:extent cx="3052036" cy="4071938"/>
             <wp:effectExtent b="50800" l="50800" r="50800" t="50800"/>
-            <wp:docPr id="4" name="image2.jpg"/>
+            <wp:docPr id="4" name="image4.jpg"/>
             <a:graphic>
               <a:graphicData uri="http://schemas.openxmlformats.org/drawingml/2006/picture">
                 <pic:pic>
                   <pic:nvPicPr>
-                    <pic:cNvPr id="0" name="image2.jpg"/>
+                    <pic:cNvPr id="0" name="image4.jpg"/>
                     <pic:cNvPicPr preferRelativeResize="0"/>
                   </pic:nvPicPr>
                   <pic:blipFill>

</xml_diff>